<commit_message>
Improve protected navigation and sign in continuity
</commit_message>
<xml_diff>
--- a/docs/ACOB_IT0049_TFA4_SessionsAndAuthentication.docx
+++ b/docs/ACOB_IT0049_TFA4_SessionsAndAuthentication.docx
@@ -2233,6 +2233,240 @@
           <w:sz w:val="20"/>
         </w:rPr>
         <w:t>I will first open a customer URL while signed out and show the redirect. I will enter a wrong password and point out the generic error, then sign in and show the customer and staff pages. I will open a new staff form to explain the password requirement and show the users.password hash in the TFA4 database without revealing a password. Finally, I will sign out and retry a protected edit URL to show that the session has ended.</w:t>
+      </w:r>
+    </w:p>
+    <w:tbl>
+      <w:tblPr>
+        <w:tblW w:type="auto" w:w="0"/>
+        <w:tblLook w:firstColumn="1" w:firstRow="1" w:lastColumn="0" w:lastRow="0" w:noHBand="0" w:noVBand="1" w:val="04A0"/>
+      </w:tblPr>
+      <w:tblGrid>
+        <w:gridCol w:w="9432"/>
+      </w:tblGrid>
+      <w:tr>
+        <w:tc>
+          <w:tcPr>
+            <w:tcW w:type="dxa" w:w="9458"/>
+            <w:shd w:fill="006A36"/>
+          </w:tcPr>
+          <w:p>
+            <w:pPr>
+              <w:spacing w:after="0"/>
+            </w:pPr>
+            <w:r>
+              <w:rPr>
+                <w:rFonts w:ascii="Times New Roman" w:hAnsi="Times New Roman"/>
+                <w:b/>
+                <w:color w:val="FFFFFF"/>
+                <w:sz w:val="30"/>
+              </w:rPr>
+              <w:t>Navigation and Sign In Continuity</w:t>
+            </w:r>
+          </w:p>
+        </w:tc>
+      </w:tr>
+    </w:tbl>
+    <w:p>
+      <w:pPr>
+        <w:spacing w:after="0"/>
+      </w:pPr>
+    </w:p>
+    <w:p>
+      <w:pPr>
+        <w:spacing w:after="120"/>
+        <w:jc w:val="both"/>
+      </w:pPr>
+      <w:r>
+        <w:rPr>
+          <w:rFonts w:ascii="Times New Roman" w:hAnsi="Times New Roman"/>
+          <w:b w:val="0"/>
+          <w:color w:val="000000"/>
+          <w:sz w:val="20"/>
+        </w:rPr>
+        <w:t>I improved the way visitors reach protected records. When signed out, I show public pages and a clear Staff sign in entry point. The Today page replaces the customer and staff shortcuts with one staff access card. After I sign in, the customer and staff links return in both the header and the Today page. The AuthFilter still blocks direct requests to protected routes.</w:t>
+      </w:r>
+    </w:p>
+    <w:p>
+      <w:pPr>
+        <w:spacing w:after="120"/>
+        <w:jc w:val="both"/>
+      </w:pPr>
+      <w:r>
+        <w:rPr>
+          <w:rFonts w:ascii="Times New Roman" w:hAnsi="Times New Roman"/>
+          <w:b w:val="0"/>
+          <w:color w:val="000000"/>
+          <w:sz w:val="20"/>
+        </w:rPr>
+        <w:t>If I open a customer or staff URL directly while signed out, the login page names the section I requested. An incorrect password keeps that message without creating a session. After a successful login, the app returns me to the requested local customer or staff page; other destinations are rejected by an allowlist.</w:t>
+      </w:r>
+    </w:p>
+    <w:p>
+      <w:pPr>
+        <w:keepNext/>
+        <w:spacing w:before="140" w:after="60"/>
+        <w:jc w:val="center"/>
+      </w:pPr>
+      <w:r>
+        <w:drawing>
+          <wp:inline>
+            <wp:extent cx="5440680" cy="2123607"/>
+            <wp:docPr id="10" name="Picture 10"/>
+            <wp:cNvGraphicFramePr>
+              <a:graphicFrameLocks noChangeAspect="1"/>
+            </wp:cNvGraphicFramePr>
+            <a:graphic>
+              <a:graphicData uri="http://schemas.openxmlformats.org/drawingml/2006/picture">
+                <pic:pic>
+                  <pic:nvPicPr>
+                    <pic:cNvPr id="0" name="navigation-14.png"/>
+                    <pic:cNvPicPr/>
+                  </pic:nvPicPr>
+                  <pic:blipFill>
+                    <a:blip r:embed="rId31"/>
+                    <a:stretch>
+                      <a:fillRect/>
+                    </a:stretch>
+                  </pic:blipFill>
+                  <pic:spPr>
+                    <a:xfrm>
+                      <a:off x="0" y="0"/>
+                      <a:ext cx="5440680" cy="2123607"/>
+                    </a:xfrm>
+                    <a:prstGeom prst="rect"/>
+                  </pic:spPr>
+                </pic:pic>
+              </a:graphicData>
+            </a:graphic>
+          </wp:inline>
+        </w:drawing>
+      </w:r>
+    </w:p>
+    <w:p>
+      <w:pPr>
+        <w:spacing w:after="200"/>
+        <w:jc w:val="center"/>
+      </w:pPr>
+      <w:r>
+        <w:rPr>
+          <w:rFonts w:ascii="Times New Roman" w:hAnsi="Times New Roman"/>
+          <w:b w:val="0"/>
+          <w:color w:val="000000"/>
+          <w:sz w:val="18"/>
+        </w:rPr>
+        <w:t>Figure 14. My signed out header shows Staff sign in instead of protected links.</w:t>
+      </w:r>
+    </w:p>
+    <w:p>
+      <w:pPr>
+        <w:keepNext/>
+        <w:spacing w:before="140" w:after="60"/>
+        <w:jc w:val="center"/>
+      </w:pPr>
+      <w:r>
+        <w:drawing>
+          <wp:inline>
+            <wp:extent cx="5440680" cy="3702213"/>
+            <wp:docPr id="11" name="Picture 11"/>
+            <wp:cNvGraphicFramePr>
+              <a:graphicFrameLocks noChangeAspect="1"/>
+            </wp:cNvGraphicFramePr>
+            <a:graphic>
+              <a:graphicData uri="http://schemas.openxmlformats.org/drawingml/2006/picture">
+                <pic:pic>
+                  <pic:nvPicPr>
+                    <pic:cNvPr id="0" name="navigation-15.png"/>
+                    <pic:cNvPicPr/>
+                  </pic:nvPicPr>
+                  <pic:blipFill>
+                    <a:blip r:embed="rId32"/>
+                    <a:stretch>
+                      <a:fillRect/>
+                    </a:stretch>
+                  </pic:blipFill>
+                  <pic:spPr>
+                    <a:xfrm>
+                      <a:off x="0" y="0"/>
+                      <a:ext cx="5440680" cy="3702213"/>
+                    </a:xfrm>
+                    <a:prstGeom prst="rect"/>
+                  </pic:spPr>
+                </pic:pic>
+              </a:graphicData>
+            </a:graphic>
+          </wp:inline>
+        </w:drawing>
+      </w:r>
+    </w:p>
+    <w:p>
+      <w:pPr>
+        <w:spacing w:after="200"/>
+        <w:jc w:val="center"/>
+      </w:pPr>
+      <w:r>
+        <w:rPr>
+          <w:rFonts w:ascii="Times New Roman" w:hAnsi="Times New Roman"/>
+          <w:b w:val="0"/>
+          <w:color w:val="000000"/>
+          <w:sz w:val="18"/>
+        </w:rPr>
+        <w:t>Figure 15. My direct customer link shows a clear sign in message.</w:t>
+      </w:r>
+    </w:p>
+    <w:p>
+      <w:pPr>
+        <w:keepNext/>
+        <w:spacing w:before="140" w:after="60"/>
+        <w:jc w:val="center"/>
+      </w:pPr>
+      <w:r>
+        <w:drawing>
+          <wp:inline>
+            <wp:extent cx="5440680" cy="2123607"/>
+            <wp:docPr id="12" name="Picture 12"/>
+            <wp:cNvGraphicFramePr>
+              <a:graphicFrameLocks noChangeAspect="1"/>
+            </wp:cNvGraphicFramePr>
+            <a:graphic>
+              <a:graphicData uri="http://schemas.openxmlformats.org/drawingml/2006/picture">
+                <pic:pic>
+                  <pic:nvPicPr>
+                    <pic:cNvPr id="0" name="navigation-16.png"/>
+                    <pic:cNvPicPr/>
+                  </pic:nvPicPr>
+                  <pic:blipFill>
+                    <a:blip r:embed="rId33"/>
+                    <a:stretch>
+                      <a:fillRect/>
+                    </a:stretch>
+                  </pic:blipFill>
+                  <pic:spPr>
+                    <a:xfrm>
+                      <a:off x="0" y="0"/>
+                      <a:ext cx="5440680" cy="2123607"/>
+                    </a:xfrm>
+                    <a:prstGeom prst="rect"/>
+                  </pic:spPr>
+                </pic:pic>
+              </a:graphicData>
+            </a:graphic>
+          </wp:inline>
+        </w:drawing>
+      </w:r>
+    </w:p>
+    <w:p>
+      <w:pPr>
+        <w:spacing w:after="200"/>
+        <w:jc w:val="center"/>
+      </w:pPr>
+      <w:r>
+        <w:rPr>
+          <w:rFonts w:ascii="Times New Roman" w:hAnsi="Times New Roman"/>
+          <w:b w:val="0"/>
+          <w:color w:val="000000"/>
+          <w:sz w:val="18"/>
+        </w:rPr>
+        <w:t>Figure 16. My signed in header restores Customer and Staff links.</w:t>
       </w:r>
     </w:p>
     <w:sectPr>

</xml_diff>